<commit_message>
Update CVs FR & EN (user revision)
</commit_message>
<xml_diff>
--- a/DEBAB_Amine_CV_FR_2026.docx
+++ b/DEBAB_Amine_CV_FR_2026.docx
@@ -8,37 +8,41 @@
         <w:tblLook w:val="04A0" w:firstRow="1" w:lastRow="0" w:firstColumn="1" w:lastColumn="0" w:noHBand="0" w:noVBand="1"/>
       </w:tblPr>
       <w:tblGrid>
-        <w:gridCol w:w="2943"/>
-        <w:gridCol w:w="8397"/>
+        <w:gridCol w:w="3085"/>
+        <w:gridCol w:w="8255"/>
       </w:tblGrid>
       <w:tr>
         <w:tc>
           <w:tcPr>
-            <w:tcW w:w="2943" w:type="dxa"/>
+            <w:tcW w:w="3085" w:type="dxa"/>
             <w:shd w:val="clear" w:color="auto" w:fill="1A2942"/>
           </w:tcPr>
           <w:p>
             <w:pPr>
+              <w:spacing w:before="60" w:after="100"/>
               <w:jc w:val="center"/>
-              <w:spacing w:before="60" w:after="100"/>
             </w:pPr>
             <w:r>
+              <w:rPr>
+                <w:noProof/>
+              </w:rPr>
               <w:drawing>
-                <wp:inline xmlns:a="http://schemas.openxmlformats.org/drawingml/2006/main" xmlns:pic="http://schemas.openxmlformats.org/drawingml/2006/picture">
+                <wp:inline distT="0" distB="0" distL="0" distR="0" wp14:anchorId="05AACB33" wp14:editId="04421549">
                   <wp:extent cx="1224000" cy="1561515"/>
+                  <wp:effectExtent l="0" t="0" r="0" b="0"/>
                   <wp:docPr id="1" name="Picture 1"/>
                   <wp:cNvGraphicFramePr>
-                    <a:graphicFrameLocks noChangeAspect="1"/>
+                    <a:graphicFrameLocks xmlns:a="http://schemas.openxmlformats.org/drawingml/2006/main" noChangeAspect="1"/>
                   </wp:cNvGraphicFramePr>
-                  <a:graphic>
+                  <a:graphic xmlns:a="http://schemas.openxmlformats.org/drawingml/2006/main">
                     <a:graphicData uri="http://schemas.openxmlformats.org/drawingml/2006/picture">
-                      <pic:pic>
+                      <pic:pic xmlns:pic="http://schemas.openxmlformats.org/drawingml/2006/picture">
                         <pic:nvPicPr>
                           <pic:cNvPr id="0" name="cv_photo_clean.jpg"/>
                           <pic:cNvPicPr/>
                         </pic:nvPicPr>
                         <pic:blipFill>
-                          <a:blip r:embed="rId8"/>
+                          <a:blip r:embed="rId6"/>
                           <a:stretch>
                             <a:fillRect/>
                           </a:stretch>
@@ -48,7 +52,9 @@
                             <a:off x="0" y="0"/>
                             <a:ext cx="1224000" cy="1561515"/>
                           </a:xfrm>
-                          <a:prstGeom prst="rect"/>
+                          <a:prstGeom prst="rect">
+                            <a:avLst/>
+                          </a:prstGeom>
                         </pic:spPr>
                       </pic:pic>
                     </a:graphicData>
@@ -153,7 +159,6 @@
                 <w:lang w:val="fr-FR"/>
               </w:rPr>
             </w:pPr>
-            <w:proofErr w:type="gramStart"/>
             <w:r>
               <w:rPr>
                 <w:color w:val="B8C5D6"/>
@@ -161,38 +166,59 @@
                 <w:lang w:val="fr-FR"/>
               </w:rPr>
               <w:t>✉  ing.debab@hotmail.fr</w:t>
-            </w:r>
-            <w:proofErr w:type="gramEnd"/>
-          </w:p>
-          <w:p>
-            <w:pPr>
-              <w:spacing w:after="40"/>
-            </w:pPr>
-            <w:r>
-              <w:rPr>
-                <w:color w:val="B8C5D6"/>
-                <w:sz w:val="16"/>
-              </w:rPr>
-              <w:t>📞 +33 6 05 70 03 46</w:t>
             </w:r>
           </w:p>
           <w:p>
             <w:pPr>
               <w:spacing w:after="40"/>
+              <w:rPr>
+                <w:lang w:val="fr-FR"/>
+              </w:rPr>
             </w:pPr>
             <w:r>
               <w:rPr>
                 <w:color w:val="B8C5D6"/>
                 <w:sz w:val="16"/>
               </w:rPr>
-              <w:t>🔗 linkedin.com/in/aminedebab</w:t>
+              <w:t>📞</w:t>
+            </w:r>
+            <w:r>
+              <w:rPr>
+                <w:color w:val="B8C5D6"/>
+                <w:sz w:val="16"/>
+                <w:lang w:val="fr-FR"/>
+              </w:rPr>
+              <w:t xml:space="preserve"> +33 6 05 70 03 46</w:t>
+            </w:r>
+          </w:p>
+          <w:p>
+            <w:pPr>
+              <w:spacing w:after="40"/>
+              <w:rPr>
+                <w:lang w:val="fr-FR"/>
+              </w:rPr>
+            </w:pPr>
+            <w:r>
+              <w:rPr>
+                <w:color w:val="B8C5D6"/>
+                <w:sz w:val="16"/>
+              </w:rPr>
+              <w:t>🔗</w:t>
+            </w:r>
+            <w:r>
+              <w:rPr>
+                <w:color w:val="B8C5D6"/>
+                <w:sz w:val="16"/>
+                <w:lang w:val="fr-FR"/>
+              </w:rPr>
+              <w:t xml:space="preserve"> linkedin.com/in/aminedebab</w:t>
             </w:r>
           </w:p>
           <w:p>
             <w:pPr>
               <w:spacing w:after="160"/>
               <w:rPr>
-                <w:lang w:val="it-IT"/>
+                <w:lang w:val="fr-FR"/>
               </w:rPr>
             </w:pPr>
             <w:r>
@@ -201,15 +227,25 @@
                 <w:sz w:val="18"/>
                 <w:szCs w:val="18"/>
               </w:rPr>
-              <w:t xml:space="preserve">🌐  </w:t>
+              <w:t>🌐</w:t>
             </w:r>
-            <w:hyperlink r:id="rId9">
+            <w:r>
+              <w:rPr>
+                <w:color w:val="B8C5D6"/>
+                <w:sz w:val="18"/>
+                <w:szCs w:val="18"/>
+                <w:lang w:val="fr-FR"/>
+              </w:rPr>
+              <w:t xml:space="preserve">  </w:t>
+            </w:r>
+            <w:hyperlink r:id="rId7">
               <w:r>
                 <w:rPr>
                   <w:color w:val="6AABCF"/>
-                  <w:u w:val="single"/>
                   <w:sz w:val="18"/>
                   <w:szCs w:val="18"/>
+                  <w:u w:val="single"/>
+                  <w:lang w:val="fr-FR"/>
                 </w:rPr>
                 <w:t>aminedebab.github.io/Portfolio</w:t>
               </w:r>
@@ -219,7 +255,7 @@
             <w:pPr>
               <w:spacing w:before="80" w:after="60"/>
               <w:rPr>
-                <w:lang w:val="it-IT"/>
+                <w:lang w:val="fr-FR"/>
               </w:rPr>
             </w:pPr>
             <w:r>
@@ -227,7 +263,7 @@
                 <w:b/>
                 <w:color w:val="E8A020"/>
                 <w:sz w:val="16"/>
-                <w:lang w:val="it-IT"/>
+                <w:lang w:val="fr-FR"/>
               </w:rPr>
               <w:t>INFORMATIONS</w:t>
             </w:r>
@@ -636,29 +672,13 @@
                 <w:color w:val="B8C5D6"/>
                 <w:sz w:val="16"/>
               </w:rPr>
-              <w:t xml:space="preserve">▪ </w:t>
-            </w:r>
-            <w:proofErr w:type="gramStart"/>
-            <w:r>
-              <w:rPr>
-                <w:color w:val="B8C5D6"/>
-                <w:sz w:val="16"/>
-              </w:rPr>
-              <w:t>Anglais :</w:t>
-            </w:r>
-            <w:proofErr w:type="gramEnd"/>
-            <w:r>
-              <w:rPr>
-                <w:color w:val="B8C5D6"/>
-                <w:sz w:val="16"/>
-              </w:rPr>
-              <w:t xml:space="preserve"> Avancé</w:t>
+              <w:t>▪ Anglais : Avancé</w:t>
             </w:r>
           </w:p>
         </w:tc>
         <w:tc>
           <w:tcPr>
-            <w:tcW w:w="8397" w:type="dxa"/>
+            <w:tcW w:w="8255" w:type="dxa"/>
             <w:shd w:val="clear" w:color="auto" w:fill="FFFFFF"/>
           </w:tcPr>
           <w:p>
@@ -752,27 +772,7 @@
                 <w:sz w:val="17"/>
                 <w:lang w:val="fr-FR"/>
               </w:rPr>
-              <w:t xml:space="preserve">Amazon Fulfillment Center LYS2, Lyon – </w:t>
-            </w:r>
-            <w:proofErr w:type="gramStart"/>
-            <w:r>
-              <w:rPr>
-                <w:i/>
-                <w:color w:val="5C6B7A"/>
-                <w:sz w:val="17"/>
-                <w:lang w:val="fr-FR"/>
-              </w:rPr>
-              <w:t>France  |</w:t>
-            </w:r>
-            <w:proofErr w:type="gramEnd"/>
-            <w:r>
-              <w:rPr>
-                <w:i/>
-                <w:color w:val="5C6B7A"/>
-                <w:sz w:val="17"/>
-                <w:lang w:val="fr-FR"/>
-              </w:rPr>
-              <w:t xml:space="preserve">  04/2026 – À ce jour</w:t>
+              <w:t>Amazon Fulfillment Center LYS2, Lyon – France  |  04/2026 – À ce jour</w:t>
             </w:r>
           </w:p>
           <w:p>
@@ -840,7 +840,7 @@
                 <w:sz w:val="18"/>
                 <w:lang w:val="fr-FR"/>
               </w:rPr>
-              <w:t>•  Constitution et management d’une équipe multiculturelle (15+ nationalités)</w:t>
+              <w:t xml:space="preserve">•  Constitution et management d’une équipe multiculturelle </w:t>
             </w:r>
           </w:p>
           <w:p>
@@ -874,27 +874,7 @@
                 <w:sz w:val="17"/>
                 <w:lang w:val="fr-FR"/>
               </w:rPr>
-              <w:t xml:space="preserve">Amazon Fulfillment Center ETZ2, Metz – </w:t>
-            </w:r>
-            <w:proofErr w:type="gramStart"/>
-            <w:r>
-              <w:rPr>
-                <w:i/>
-                <w:color w:val="5C6B7A"/>
-                <w:sz w:val="17"/>
-                <w:lang w:val="fr-FR"/>
-              </w:rPr>
-              <w:t>France  |</w:t>
-            </w:r>
-            <w:proofErr w:type="gramEnd"/>
-            <w:r>
-              <w:rPr>
-                <w:i/>
-                <w:color w:val="5C6B7A"/>
-                <w:sz w:val="17"/>
-                <w:lang w:val="fr-FR"/>
-              </w:rPr>
-              <w:t xml:space="preserve">  07/2024 – 03/2026</w:t>
+              <w:t>Amazon Fulfillment Center ETZ2, Metz – France  |  07/2024 – 03/2026</w:t>
             </w:r>
           </w:p>
           <w:p>
@@ -979,7 +959,7 @@
                 <w:sz w:val="18"/>
                 <w:lang w:val="fr-FR"/>
               </w:rPr>
-              <w:t>•  Formation et recrutement de 2 apprentis (promués en CDI)</w:t>
+              <w:t>•  Formation et recrutement de 2 apprentis en CDI</w:t>
             </w:r>
           </w:p>
           <w:p>
@@ -996,7 +976,7 @@
                 <w:sz w:val="18"/>
                 <w:lang w:val="fr-FR"/>
               </w:rPr>
-              <w:t>•  Automatisation du reporting JAM DPMO via Python : 3h → 20 min (-89%)</w:t>
+              <w:t xml:space="preserve">•  Automatisation du reporting JAM DPMO via Python </w:t>
             </w:r>
           </w:p>
           <w:p>
@@ -1013,12 +993,15 @@
                 <w:sz w:val="18"/>
                 <w:lang w:val="fr-FR"/>
               </w:rPr>
-              <w:t>•  OEE SLAM maintenu &gt; 95% — flash report adopté comme standard site</w:t>
+              <w:t xml:space="preserve">•  OEE SLAM maintenu &gt; 95% </w:t>
             </w:r>
           </w:p>
           <w:p>
             <w:pPr>
               <w:spacing w:before="120"/>
+              <w:rPr>
+                <w:lang w:val="fr-FR"/>
+              </w:rPr>
             </w:pPr>
             <w:r>
               <w:rPr>
@@ -1026,66 +1009,71 @@
                 <w:color w:val="1A2942"/>
                 <w:sz w:val="20"/>
                 <w:szCs w:val="20"/>
+                <w:lang w:val="fr-FR"/>
               </w:rPr>
               <w:t>Superviseur de Production</w:t>
             </w:r>
           </w:p>
           <w:p>
-            <w:pPr/>
+            <w:pPr>
+              <w:rPr>
+                <w:lang w:val="fr-FR"/>
+              </w:rPr>
+            </w:pPr>
             <w:r>
               <w:rPr>
                 <w:color w:val="5C6B7A"/>
                 <w:sz w:val="17"/>
                 <w:szCs w:val="17"/>
-              </w:rPr>
-              <w:t>Greif, France</w:t>
-            </w:r>
-            <w:r>
-              <w:rPr>
-                <w:color w:val="5C6B7A"/>
-                <w:sz w:val="17"/>
-                <w:szCs w:val="17"/>
-              </w:rPr>
-              <w:t xml:space="preserve">  |</w:t>
-            </w:r>
-            <w:r>
-              <w:rPr>
-                <w:color w:val="5C6B7A"/>
-                <w:sz w:val="17"/>
-                <w:szCs w:val="17"/>
-              </w:rPr>
-              <w:t xml:space="preserve">  10/2023 – 06/2024</w:t>
+                <w:lang w:val="fr-FR"/>
+              </w:rPr>
+              <w:t>Greif, France  |  10/2023 – 06/2024</w:t>
             </w:r>
           </w:p>
           <w:p>
-            <w:pPr/>
+            <w:pPr>
+              <w:rPr>
+                <w:lang w:val="fr-FR"/>
+              </w:rPr>
+            </w:pPr>
             <w:r>
               <w:rPr>
                 <w:color w:val="2D3748"/>
                 <w:sz w:val="18"/>
                 <w:szCs w:val="18"/>
+                <w:lang w:val="fr-FR"/>
               </w:rPr>
               <w:t>•  Supervision des lignes de production de fûts industriels (acier et HDPE)</w:t>
             </w:r>
           </w:p>
           <w:p>
-            <w:pPr/>
+            <w:pPr>
+              <w:rPr>
+                <w:lang w:val="fr-FR"/>
+              </w:rPr>
+            </w:pPr>
             <w:r>
               <w:rPr>
                 <w:color w:val="2D3748"/>
                 <w:sz w:val="18"/>
                 <w:szCs w:val="18"/>
+                <w:lang w:val="fr-FR"/>
               </w:rPr>
               <w:t>•  Management des équipes de production, planification des tâches quotidiennes</w:t>
             </w:r>
           </w:p>
           <w:p>
-            <w:pPr/>
+            <w:pPr>
+              <w:rPr>
+                <w:lang w:val="fr-FR"/>
+              </w:rPr>
+            </w:pPr>
             <w:r>
               <w:rPr>
                 <w:color w:val="2D3748"/>
                 <w:sz w:val="18"/>
                 <w:szCs w:val="18"/>
+                <w:lang w:val="fr-FR"/>
               </w:rPr>
               <w:t>•  Application des règles et procédures HSE sur le poste de travail</w:t>
             </w:r>
@@ -1121,27 +1109,7 @@
                 <w:sz w:val="17"/>
                 <w:lang w:val="fr-FR"/>
               </w:rPr>
-              <w:t xml:space="preserve">DiamGrain, Ouedtlelat – </w:t>
-            </w:r>
-            <w:proofErr w:type="gramStart"/>
-            <w:r>
-              <w:rPr>
-                <w:i/>
-                <w:color w:val="5C6B7A"/>
-                <w:sz w:val="17"/>
-                <w:lang w:val="fr-FR"/>
-              </w:rPr>
-              <w:t>Algérie  |</w:t>
-            </w:r>
-            <w:proofErr w:type="gramEnd"/>
-            <w:r>
-              <w:rPr>
-                <w:i/>
-                <w:color w:val="5C6B7A"/>
-                <w:sz w:val="17"/>
-                <w:lang w:val="fr-FR"/>
-              </w:rPr>
-              <w:t xml:space="preserve">  01/2021 – 10/2023</w:t>
+              <w:t>DiamGrain, Ouedtlelat – Algérie  |  01/2021 – 10/2023</w:t>
             </w:r>
           </w:p>
           <w:p>
@@ -1192,7 +1160,7 @@
                 <w:sz w:val="18"/>
                 <w:lang w:val="fr-FR"/>
               </w:rPr>
-              <w:t>•  Développement système monitoring Arduino : 1 650 € vs 12 000 € commercial, ROI 3,5 mois</w:t>
+              <w:t xml:space="preserve">•  Développement système monitoring Arduino </w:t>
             </w:r>
           </w:p>
           <w:p>
@@ -1209,7 +1177,7 @@
                 <w:sz w:val="18"/>
                 <w:lang w:val="fr-FR"/>
               </w:rPr>
-              <w:t>•  Disponibilité équipements : 78 % → 94 % en 18 mois | Pannes imprévues : -60 %</w:t>
+              <w:t xml:space="preserve">•  Disponibilité équipements : 78 % → 94 % en 18 mois </w:t>
             </w:r>
           </w:p>
           <w:p>
@@ -1243,27 +1211,7 @@
                 <w:sz w:val="17"/>
                 <w:lang w:val="fr-FR"/>
               </w:rPr>
-              <w:t xml:space="preserve">Linde Gaz, Arzew – </w:t>
-            </w:r>
-            <w:proofErr w:type="gramStart"/>
-            <w:r>
-              <w:rPr>
-                <w:i/>
-                <w:color w:val="5C6B7A"/>
-                <w:sz w:val="17"/>
-                <w:lang w:val="fr-FR"/>
-              </w:rPr>
-              <w:t>Algérie  |</w:t>
-            </w:r>
-            <w:proofErr w:type="gramEnd"/>
-            <w:r>
-              <w:rPr>
-                <w:i/>
-                <w:color w:val="5C6B7A"/>
-                <w:sz w:val="17"/>
-                <w:lang w:val="fr-FR"/>
-              </w:rPr>
-              <w:t xml:space="preserve">  08/2016 – 01/2021</w:t>
+              <w:t>Linde Gaz, Arzew – Algérie  |  08/2016 – 01/2021</w:t>
             </w:r>
           </w:p>
           <w:p>
@@ -1348,27 +1296,7 @@
                 <w:sz w:val="17"/>
                 <w:lang w:val="fr-FR"/>
               </w:rPr>
-              <w:t xml:space="preserve">Sonelgaz, Arzew – </w:t>
-            </w:r>
-            <w:proofErr w:type="gramStart"/>
-            <w:r>
-              <w:rPr>
-                <w:i/>
-                <w:color w:val="5C6B7A"/>
-                <w:sz w:val="17"/>
-                <w:lang w:val="fr-FR"/>
-              </w:rPr>
-              <w:t>Algérie  |</w:t>
-            </w:r>
-            <w:proofErr w:type="gramEnd"/>
-            <w:r>
-              <w:rPr>
-                <w:i/>
-                <w:color w:val="5C6B7A"/>
-                <w:sz w:val="17"/>
-                <w:lang w:val="fr-FR"/>
-              </w:rPr>
-              <w:t xml:space="preserve">  11/2014 – 08/2016</w:t>
+              <w:t>Sonelgaz, Arzew – Algérie  |  11/2014 – 08/2016</w:t>
             </w:r>
           </w:p>
           <w:p>
@@ -1453,27 +1381,7 @@
                 <w:sz w:val="17"/>
                 <w:lang w:val="fr-FR"/>
               </w:rPr>
-              <w:t xml:space="preserve">Mobiserve, Alger – </w:t>
-            </w:r>
-            <w:proofErr w:type="gramStart"/>
-            <w:r>
-              <w:rPr>
-                <w:i/>
-                <w:color w:val="5C6B7A"/>
-                <w:sz w:val="17"/>
-                <w:lang w:val="fr-FR"/>
-              </w:rPr>
-              <w:t>Algérie  |</w:t>
-            </w:r>
-            <w:proofErr w:type="gramEnd"/>
-            <w:r>
-              <w:rPr>
-                <w:i/>
-                <w:color w:val="5C6B7A"/>
-                <w:sz w:val="17"/>
-                <w:lang w:val="fr-FR"/>
-              </w:rPr>
-              <w:t xml:space="preserve">  04/2014 – 11/2014</w:t>
+              <w:t>Mobiserve, Alger – Algérie  |  04/2014 – 11/2014</w:t>
             </w:r>
           </w:p>
           <w:p>
@@ -1524,27 +1432,7 @@
                 <w:sz w:val="17"/>
                 <w:lang w:val="fr-FR"/>
               </w:rPr>
-              <w:t xml:space="preserve">FerobMetal, Oran – </w:t>
-            </w:r>
-            <w:proofErr w:type="gramStart"/>
-            <w:r>
-              <w:rPr>
-                <w:i/>
-                <w:color w:val="5C6B7A"/>
-                <w:sz w:val="17"/>
-                <w:lang w:val="fr-FR"/>
-              </w:rPr>
-              <w:t>Algérie  |</w:t>
-            </w:r>
-            <w:proofErr w:type="gramEnd"/>
-            <w:r>
-              <w:rPr>
-                <w:i/>
-                <w:color w:val="5C6B7A"/>
-                <w:sz w:val="17"/>
-                <w:lang w:val="fr-FR"/>
-              </w:rPr>
-              <w:t xml:space="preserve">  08/2012 – 04/2014</w:t>
+              <w:t>FerobMetal, Oran – Algérie  |  08/2012 – 04/2014</w:t>
             </w:r>
           </w:p>
           <w:p>
@@ -1595,27 +1483,7 @@
                 <w:sz w:val="17"/>
                 <w:lang w:val="fr-FR"/>
               </w:rPr>
-              <w:t xml:space="preserve">MHI, Oran – </w:t>
-            </w:r>
-            <w:proofErr w:type="gramStart"/>
-            <w:r>
-              <w:rPr>
-                <w:i/>
-                <w:color w:val="5C6B7A"/>
-                <w:sz w:val="17"/>
-                <w:lang w:val="fr-FR"/>
-              </w:rPr>
-              <w:t>Algérie  |</w:t>
-            </w:r>
-            <w:proofErr w:type="gramEnd"/>
-            <w:r>
-              <w:rPr>
-                <w:i/>
-                <w:color w:val="5C6B7A"/>
-                <w:sz w:val="17"/>
-                <w:lang w:val="fr-FR"/>
-              </w:rPr>
-              <w:t xml:space="preserve">  01/2012 – 08/2012</w:t>
+              <w:t>MHI, Oran – Algérie  |  01/2012 – 08/2012</w:t>
             </w:r>
           </w:p>
           <w:p>

</xml_diff>